<commit_message>
Revise transformer specification for wire winding and window review
</commit_message>
<xml_diff>
--- a/docs/PQ3235_Spec_V1.docx
+++ b/docs/PQ3235_Spec_V1.docx
@@ -4,7 +4,7 @@
   <w:body>
     <w:p>
       <w:pPr>
-        <w:spacing w:after="60"/>
+        <w:spacing w:after="30"/>
         <w:jc w:val="center"/>
       </w:pPr>
       <w:r>
@@ -13,12 +13,12 @@
           <w:b/>
           <w:sz w:val="34"/>
         </w:rPr>
-        <w:t>样品规格书</w:t>
+        <w:t>线绕方案窗口评审表</w:t>
       </w:r>
     </w:p>
     <w:p>
       <w:pPr>
-        <w:spacing w:after="60"/>
+        <w:spacing w:after="30"/>
       </w:pPr>
       <w:r>
         <w:rPr>
@@ -31,7 +31,7 @@
     </w:p>
     <w:p>
       <w:pPr>
-        <w:spacing w:after="60"/>
+        <w:spacing w:after="30"/>
       </w:pPr>
       <w:r>
         <w:rPr>
@@ -44,7 +44,7 @@
     </w:p>
     <w:p>
       <w:pPr>
-        <w:spacing w:after="60"/>
+        <w:spacing w:after="30"/>
       </w:pPr>
       <w:r>
         <w:rPr>
@@ -52,12 +52,12 @@
           <w:b w:val="0"/>
           <w:sz w:val="20"/>
         </w:rPr>
-        <w:t>日期：2026/10/13　　　　　　　　　版本：V1.0（打样评审，非量产放行）</w:t>
+        <w:t>日期：2026/10/13　　　　　　　　　版本：V1.1（窗口待确认，非绕制工单）</w:t>
       </w:r>
     </w:p>
     <w:p>
       <w:pPr>
-        <w:spacing w:after="60"/>
+        <w:spacing w:after="30"/>
       </w:pPr>
       <w:r>
         <w:rPr>
@@ -65,12 +65,26 @@
           <w:b/>
           <w:sz w:val="18"/>
         </w:rPr>
-        <w:t>额定目标：380VDC输入；48VDC整机输出；110kHz/只；1000W/只；双路合计2000W。</w:t>
+        <w:t>设计工况：380VDC；48V整机输出；110kHz/只；目标1000W/只、合计2000W。</w:t>
       </w:r>
     </w:p>
     <w:p>
       <w:pPr>
-        <w:spacing w:after="60"/>
+        <w:spacing w:after="30"/>
+      </w:pPr>
+      <w:r>
+        <w:rPr>
+          <w:rFonts w:ascii="Noto Sans CJK SC" w:hAnsi="Noto Sans CJK SC" w:eastAsia="Noto Sans CJK SC"/>
+          <w:b/>
+          <w:color w:val="9C2D22"/>
+          <w:sz w:val="18"/>
+        </w:rPr>
+        <w:t>V1.0铜箔方案停用。本版全部按线绕评审；52:8只是参考，未取得实物尺寸和完成排层前，不得作为绕制工单。</w:t>
+      </w:r>
+    </w:p>
+    <w:p>
+      <w:pPr>
+        <w:spacing w:after="30"/>
       </w:pPr>
       <w:r>
         <w:rPr>
@@ -103,7 +117,7 @@
             <w:r>
               <w:drawing>
                 <wp:inline xmlns:a="http://schemas.openxmlformats.org/drawingml/2006/main" xmlns:pic="http://schemas.openxmlformats.org/drawingml/2006/picture">
-                  <wp:extent cx="3132000" cy="2292536"/>
+                  <wp:extent cx="2808000" cy="2055377"/>
                   <wp:docPr id="1" name="Picture 1"/>
                   <wp:cNvGraphicFramePr>
                     <a:graphicFrameLocks noChangeAspect="1"/>
@@ -124,7 +138,7 @@
                         <pic:spPr>
                           <a:xfrm>
                             <a:off x="0" y="0"/>
-                            <a:ext cx="3132000" cy="2292536"/>
+                            <a:ext cx="2808000" cy="2055377"/>
                           </a:xfrm>
                           <a:prstGeom prst="rect"/>
                         </pic:spPr>
@@ -147,7 +161,7 @@
             <w:r>
               <w:drawing>
                 <wp:inline xmlns:a="http://schemas.openxmlformats.org/drawingml/2006/main" xmlns:pic="http://schemas.openxmlformats.org/drawingml/2006/picture">
-                  <wp:extent cx="3132000" cy="2292536"/>
+                  <wp:extent cx="2808000" cy="2055377"/>
                   <wp:docPr id="2" name="Picture 2"/>
                   <wp:cNvGraphicFramePr>
                     <a:graphicFrameLocks noChangeAspect="1"/>
@@ -168,7 +182,7 @@
                         <pic:spPr>
                           <a:xfrm>
                             <a:off x="0" y="0"/>
-                            <a:ext cx="3132000" cy="2292536"/>
+                            <a:ext cx="2808000" cy="2055377"/>
                           </a:xfrm>
                           <a:prstGeom prst="rect"/>
                         </pic:spPr>
@@ -184,7 +198,7 @@
     </w:tbl>
     <w:p>
       <w:pPr>
-        <w:spacing w:after="60"/>
+        <w:spacing w:after="30"/>
       </w:pPr>
       <w:r>
         <w:rPr>
@@ -493,7 +507,7 @@
                 <w:rFonts w:ascii="Noto Sans CJK SC" w:hAnsi="Noto Sans CJK SC" w:eastAsia="Noto Sans CJK SC"/>
                 <w:sz w:val="15"/>
               </w:rPr>
-              <w:t>26T</w:t>
+              <w:t>26T参考</w:t>
             </w:r>
           </w:p>
         </w:tc>
@@ -662,7 +676,7 @@
                 <w:rFonts w:ascii="Noto Sans CJK SC" w:hAnsi="Noto Sans CJK SC" w:eastAsia="Noto Sans CJK SC"/>
                 <w:sz w:val="15"/>
               </w:rPr>
-              <w:t>2T</w:t>
+              <w:t>2T参考</w:t>
             </w:r>
           </w:p>
         </w:tc>
@@ -793,9 +807,9 @@
                 <w:rFonts w:ascii="Noto Sans CJK SC" w:hAnsi="Noto Sans CJK SC" w:eastAsia="Noto Sans CJK SC"/>
                 <w:sz w:val="15"/>
               </w:rPr>
-              <w:t>3×(0.20×10mm)</w:t>
+              <w:t>多股漆包线/利兹线</w:t>
               <w:br/>
-              <w:t>总裸铜6mm²</w:t>
+              <w:t>根数、成品尺寸待定</w:t>
             </w:r>
           </w:p>
         </w:tc>
@@ -813,9 +827,9 @@
                 <w:rFonts w:ascii="Noto Sans CJK SC" w:hAnsi="Noto Sans CJK SC" w:eastAsia="Noto Sans CJK SC"/>
                 <w:sz w:val="15"/>
               </w:rPr>
-              <w:t>绝缘铜箔</w:t>
+              <w:t>线绕，不用铜箔</w:t>
               <w:br/>
-              <w:t>三片并联</w:t>
+              <w:t>可讨论两束并绕</w:t>
             </w:r>
           </w:p>
         </w:tc>
@@ -833,7 +847,7 @@
                 <w:rFonts w:ascii="Noto Sans CJK SC" w:hAnsi="Noto Sans CJK SC" w:eastAsia="Noto Sans CJK SC"/>
                 <w:sz w:val="15"/>
               </w:rPr>
-              <w:t>8T</w:t>
+              <w:t>8T参考</w:t>
             </w:r>
           </w:p>
         </w:tc>
@@ -887,7 +901,7 @@
                 <w:rFonts w:ascii="Noto Sans CJK SC" w:hAnsi="Noto Sans CJK SC" w:eastAsia="Noto Sans CJK SC"/>
                 <w:sz w:val="15"/>
               </w:rPr>
-              <w:t>逐匝绝缘</w:t>
+              <w:t>按实排绝缘</w:t>
             </w:r>
           </w:p>
         </w:tc>
@@ -905,7 +919,7 @@
                 <w:rFonts w:ascii="Noto Sans CJK SC" w:hAnsi="Noto Sans CJK SC" w:eastAsia="Noto Sans CJK SC"/>
                 <w:sz w:val="15"/>
               </w:rPr>
-              <w:t>三片同向同匝，起止等长并联</w:t>
+              <w:t>等匝、等长、同相并联；尺寸未锁</w:t>
             </w:r>
           </w:p>
         </w:tc>
@@ -1002,7 +1016,7 @@
                 <w:rFonts w:ascii="Noto Sans CJK SC" w:hAnsi="Noto Sans CJK SC" w:eastAsia="Noto Sans CJK SC"/>
                 <w:sz w:val="15"/>
               </w:rPr>
-              <w:t>2T</w:t>
+              <w:t>2T参考</w:t>
             </w:r>
           </w:p>
         </w:tc>
@@ -1171,7 +1185,7 @@
                 <w:rFonts w:ascii="Noto Sans CJK SC" w:hAnsi="Noto Sans CJK SC" w:eastAsia="Noto Sans CJK SC"/>
                 <w:sz w:val="15"/>
               </w:rPr>
-              <w:t>26T</w:t>
+              <w:t>26T参考</w:t>
             </w:r>
           </w:p>
         </w:tc>
@@ -1251,7 +1265,7 @@
     </w:tbl>
     <w:p>
       <w:pPr>
-        <w:spacing w:after="60"/>
+        <w:spacing w:after="30"/>
       </w:pPr>
       <w:r>
         <w:rPr>
@@ -1259,34 +1273,7 @@
           <w:b w:val="0"/>
           <w:sz w:val="16"/>
         </w:rPr>
-        <w:t>引出：8红线、9蓝线，建议≥6mm²耐温多股绝缘线；长度、位置按实物确认。可焊到加强端子/铜柱，但普通细针脚不能作为唯一大电流路径。</w:t>
-      </w:r>
-    </w:p>
-    <w:p>
-      <w:pPr>
-        <w:spacing w:after="60"/>
-      </w:pPr>
-      <w:r>
-        <w:rPr>
-          <w:rFonts w:ascii="Noto Sans CJK SC" w:hAnsi="Noto Sans CJK SC" w:eastAsia="Noto Sans CJK SC"/>
-          <w:b/>
-          <w:sz w:val="16"/>
-        </w:rPr>
-        <w:t>接法：8→公共LV（输出电感前）；9→本路SR漏极，不接输出GND。2与4由PCB外部同网；1脚抽头外部NC。4–5不是复位绕组，6–7不是普通辅助电源。</w:t>
-      </w:r>
-    </w:p>
-    <w:p>
-      <w:pPr>
-        <w:spacing w:after="60"/>
-      </w:pPr>
-      <w:r>
-        <w:rPr>
-          <w:rFonts w:ascii="Noto Sans CJK SC" w:hAnsi="Noto Sans CJK SC" w:eastAsia="Noto Sans CJK SC"/>
-          <w:b/>
-          <w:color w:val="9C2D22"/>
-          <w:sz w:val="16"/>
-        </w:rPr>
-        <w:t>铜箔宽度必须扣除端部绝缘余量；若骨架容纳不下，此版不能直接投制，须回传排层/窗口评审。</w:t>
+        <w:t>引出：8红线、9蓝线，用耐温多股铜线或内部利兹连续引出；截面、长度按27A左右RMS和温升确定。可焊到加强端子/铜柱，但普通细针脚不能作为唯一大电流路径。</w:t>
       </w:r>
     </w:p>
     <w:p>
@@ -1296,7 +1283,7 @@
     </w:p>
     <w:p>
       <w:pPr>
-        <w:spacing w:after="60"/>
+        <w:spacing w:after="30"/>
         <w:jc w:val="center"/>
       </w:pPr>
       <w:r>
@@ -1310,7 +1297,34 @@
     </w:p>
     <w:p>
       <w:pPr>
-        <w:spacing w:after="60"/>
+        <w:spacing w:after="30"/>
+      </w:pPr>
+      <w:r>
+        <w:rPr>
+          <w:rFonts w:ascii="Noto Sans CJK SC" w:hAnsi="Noto Sans CJK SC" w:eastAsia="Noto Sans CJK SC"/>
+          <w:b/>
+          <w:sz w:val="16"/>
+        </w:rPr>
+        <w:t>接法：8→公共LV（输出电感前）；9→本路SR漏极，不接输出GND。2与4由PCB外部同网；1脚抽头外部NC。4–5不是复位绕组，6–7不是普通辅助电源。</w:t>
+      </w:r>
+    </w:p>
+    <w:p>
+      <w:pPr>
+        <w:spacing w:after="30"/>
+      </w:pPr>
+      <w:r>
+        <w:rPr>
+          <w:rFonts w:ascii="Noto Sans CJK SC" w:hAnsi="Noto Sans CJK SC" w:eastAsia="Noto Sans CJK SC"/>
+          <w:b/>
+          <w:color w:val="9C2D22"/>
+          <w:sz w:val="16"/>
+        </w:rPr>
+        <w:t>必须按成品线束外形逐层排布；不以裸铜面积证明装得下，也不靠减绝缘硬塞。取得净绕宽、径向高度、实际线材和Ae后再定案。</w:t>
+      </w:r>
+    </w:p>
+    <w:p>
+      <w:pPr>
+        <w:spacing w:after="30"/>
       </w:pPr>
       <w:r>
         <w:rPr>
@@ -1318,7 +1332,7 @@
           <w:b/>
           <w:sz w:val="18"/>
         </w:rPr>
-        <w:t>测试项目：所有数值为首样设计验收目标；下列项目未做实物测试，不代表已合格。</w:t>
+        <w:t>测试项目：以下保留52:8参考的验收讨论条件；匝数/线材未锁，未做实测，不代表已合格。</w:t>
       </w:r>
     </w:p>
     <w:tbl>
@@ -1394,7 +1408,7 @@
                 <w:b/>
                 <w:sz w:val="16"/>
               </w:rPr>
-              <w:t>首样目标与判定</w:t>
+              <w:t>参考目标与待确认项</w:t>
             </w:r>
           </w:p>
         </w:tc>
@@ -1992,7 +2006,7 @@
     </w:tbl>
     <w:p>
       <w:pPr>
-        <w:spacing w:after="60"/>
+        <w:spacing w:after="30"/>
       </w:pPr>
       <w:r>
         <w:rPr>
@@ -2363,7 +2377,7 @@
                 <w:rFonts w:ascii="Noto Sans CJK SC" w:hAnsi="Noto Sans CJK SC" w:eastAsia="Noto Sans CJK SC"/>
                 <w:sz w:val="15"/>
               </w:rPr>
-              <w:t>主初级120×Φ0.10mm Class180利兹；辅助Φ0.30mm；飞线≥6mm²</w:t>
+              <w:t>主初级120×Φ0.10mm仅参考；辅助Φ0.30mm；全部成品尺寸及飞线截面待签审</w:t>
             </w:r>
           </w:p>
         </w:tc>
@@ -2438,7 +2452,7 @@
                 <w:rFonts w:ascii="Noto Sans CJK SC" w:hAnsi="Noto Sans CJK SC" w:eastAsia="Noto Sans CJK SC"/>
                 <w:sz w:val="15"/>
               </w:rPr>
-              <w:t>COPPER FOIL</w:t>
+              <w:t>SECONDARY WIRE</w:t>
             </w:r>
           </w:p>
         </w:tc>
@@ -2456,7 +2470,7 @@
                 <w:rFonts w:ascii="Noto Sans CJK SC" w:hAnsi="Noto Sans CJK SC" w:eastAsia="Noto Sans CJK SC"/>
                 <w:sz w:val="15"/>
               </w:rPr>
-              <w:t>0.20×10mm三片绝缘并联，总6mm²；宽度需适配净绕宽</w:t>
+              <w:t>漆包并线/真正换位利兹；供应商填写股数、单股径、成品外径或扁束宽厚；不使用铜箔</w:t>
             </w:r>
           </w:p>
         </w:tc>
@@ -2777,7 +2791,7 @@
     </w:tbl>
     <w:p>
       <w:pPr>
-        <w:spacing w:after="60"/>
+        <w:spacing w:after="30"/>
       </w:pPr>
       <w:r>
         <w:rPr>
@@ -2969,7 +2983,7 @@
     </w:p>
     <w:p>
       <w:pPr>
-        <w:spacing w:after="60"/>
+        <w:spacing w:after="30"/>
         <w:jc w:val="center"/>
       </w:pPr>
       <w:r>
@@ -2978,12 +2992,12 @@
           <w:b/>
           <w:sz w:val="28"/>
         </w:rPr>
-        <w:t>设计依据、计算与原理图对应</w:t>
+        <w:t>电气参考、窗口计算与待确认</w:t>
       </w:r>
     </w:p>
     <w:p>
       <w:pPr>
-        <w:spacing w:after="60"/>
+        <w:spacing w:after="30"/>
       </w:pPr>
       <w:r>
         <w:rPr>
@@ -2996,7 +3010,7 @@
     </w:p>
     <w:p>
       <w:pPr>
-        <w:spacing w:after="60"/>
+        <w:spacing w:after="30"/>
       </w:pPr>
       <w:r>
         <w:rPr>
@@ -3428,7 +3442,7 @@
                 <w:rFonts w:ascii="Noto Sans CJK SC" w:hAnsi="Noto Sans CJK SC" w:eastAsia="Noto Sans CJK SC"/>
                 <w:sz w:val="16"/>
               </w:rPr>
-              <w:t>仅主次裸铜ΣN·A≈97.0mm²；未计辅助、漆包、胶带和余量</w:t>
+              <w:t>V1.0参考仅主次裸铜ΣN·A≈97.0mm²；未计辅助、漆包、胶带和余量</w:t>
             </w:r>
           </w:p>
         </w:tc>
@@ -3436,7 +3450,7 @@
     </w:tbl>
     <w:p>
       <w:pPr>
-        <w:spacing w:after="60"/>
+        <w:spacing w:after="30"/>
       </w:pPr>
       <w:r>
         <w:rPr>
@@ -3449,7 +3463,7 @@
     </w:p>
     <w:p>
       <w:pPr>
-        <w:spacing w:after="60"/>
+        <w:spacing w:after="30"/>
       </w:pPr>
       <w:r>
         <w:rPr>
@@ -3462,7 +3476,7 @@
     </w:p>
     <w:p>
       <w:pPr>
-        <w:spacing w:after="60"/>
+        <w:spacing w:after="30"/>
       </w:pPr>
       <w:r>
         <w:rPr>
@@ -3475,7 +3489,7 @@
     </w:p>
     <w:p>
       <w:pPr>
-        <w:spacing w:after="60"/>
+        <w:spacing w:after="30"/>
       </w:pPr>
       <w:r>
         <w:rPr>
@@ -3488,7 +3502,7 @@
     </w:p>
     <w:p>
       <w:pPr>
-        <w:spacing w:after="60"/>
+        <w:spacing w:after="30"/>
       </w:pPr>
       <w:r>
         <w:rPr>
@@ -3501,7 +3515,7 @@
     </w:p>
     <w:p>
       <w:pPr>
-        <w:spacing w:after="60"/>
+        <w:spacing w:after="30"/>
       </w:pPr>
       <w:r>
         <w:rPr>
@@ -3514,7 +3528,7 @@
     </w:p>
     <w:p>
       <w:pPr>
-        <w:spacing w:after="60"/>
+        <w:spacing w:after="30"/>
       </w:pPr>
       <w:r>
         <w:rPr>
@@ -3527,7 +3541,7 @@
     </w:p>
     <w:p>
       <w:pPr>
-        <w:spacing w:after="60"/>
+        <w:spacing w:after="30"/>
       </w:pPr>
       <w:r>
         <w:rPr>
@@ -3540,7 +3554,7 @@
     </w:p>
     <w:p>
       <w:pPr>
-        <w:spacing w:after="60"/>
+        <w:spacing w:after="30"/>
       </w:pPr>
       <w:r>
         <w:rPr>
@@ -3549,7 +3563,1351 @@
           <w:color w:val="9C2D22"/>
           <w:sz w:val="16"/>
         </w:rPr>
-        <w:t>本文件按用户模板栏目编制；52:8与2T辅助是可审查的首样方案，不是已经测试通过的量产规格。</w:t>
+        <w:t>本版已取消铜箔。52:8及辅助2T保留为电气参考，最终匝数、线材、窗口与连续1kW额定未确认，不能按本评审表投制。</w:t>
+      </w:r>
+    </w:p>
+    <w:p>
+      <w:r>
+        <w:br w:type="page"/>
+      </w:r>
+    </w:p>
+    <w:p>
+      <w:pPr>
+        <w:spacing w:after="30"/>
+        <w:jc w:val="center"/>
+      </w:pPr>
+      <w:r>
+        <w:rPr>
+          <w:rFonts w:ascii="Noto Sans CJK SC" w:hAnsi="Noto Sans CJK SC" w:eastAsia="Noto Sans CJK SC"/>
+          <w:b/>
+          <w:sz w:val="28"/>
+        </w:rPr>
+        <w:t>窗口必须按实物排层：供应商回填页</w:t>
+      </w:r>
+    </w:p>
+    <w:p>
+      <w:pPr>
+        <w:spacing w:after="30"/>
+      </w:pPr>
+      <w:r>
+        <w:rPr>
+          <w:rFonts w:ascii="Noto Sans CJK SC" w:hAnsi="Noto Sans CJK SC" w:eastAsia="Noto Sans CJK SC"/>
+          <w:b/>
+          <w:sz w:val="18"/>
+        </w:rPr>
+        <w:t>已确认：功率次级线绕、8/9飞线，不采用铜箔。以下尺寸缺失是目前不能定最终绕制参数的原因。</w:t>
+      </w:r>
+    </w:p>
+    <w:tbl>
+      <w:tblPr>
+        <w:tblStyle w:val="5"/>
+        <w:tblW w:type="auto" w:w="0"/>
+        <w:jc w:val="center"/>
+        <w:tblLayout w:type="fixed"/>
+        <w:tblLook w:firstColumn="1" w:firstRow="1" w:lastColumn="0" w:lastRow="0" w:noHBand="0" w:noVBand="1" w:val="04A0"/>
+      </w:tblPr>
+      <w:tblGrid>
+        <w:gridCol w:w="3685"/>
+        <w:gridCol w:w="6746"/>
+      </w:tblGrid>
+      <w:tr>
+        <w:trPr>
+          <w:cantSplit/>
+        </w:trPr>
+        <w:tc>
+          <w:tcPr>
+            <w:tcW w:type="dxa" w:w="5233"/>
+            <w:vAlign w:val="center"/>
+            <w:shd w:fill="E9EEF4"/>
+          </w:tcPr>
+          <w:p>
+            <w:pPr>
+              <w:spacing w:before="20" w:after="20" w:line="247" w:lineRule="auto"/>
+            </w:pPr>
+            <w:r>
+              <w:rPr>
+                <w:rFonts w:ascii="Noto Sans CJK SC" w:hAnsi="Noto Sans CJK SC" w:eastAsia="Noto Sans CJK SC"/>
+                <w:b/>
+                <w:sz w:val="17"/>
+              </w:rPr>
+              <w:t>必须回填的实物数据</w:t>
+            </w:r>
+          </w:p>
+        </w:tc>
+        <w:tc>
+          <w:tcPr>
+            <w:tcW w:type="dxa" w:w="5233"/>
+            <w:vAlign w:val="center"/>
+            <w:shd w:fill="E9EEF4"/>
+          </w:tcPr>
+          <w:p>
+            <w:pPr>
+              <w:spacing w:before="20" w:after="20" w:line="247" w:lineRule="auto"/>
+            </w:pPr>
+            <w:r>
+              <w:rPr>
+                <w:rFonts w:ascii="Noto Sans CJK SC" w:hAnsi="Noto Sans CJK SC" w:eastAsia="Noto Sans CJK SC"/>
+                <w:b/>
+                <w:sz w:val="17"/>
+              </w:rPr>
+              <w:t>填写值/说明</w:t>
+            </w:r>
+          </w:p>
+        </w:tc>
+      </w:tr>
+      <w:tr>
+        <w:trPr>
+          <w:cantSplit/>
+        </w:trPr>
+        <w:tc>
+          <w:tcPr>
+            <w:tcW w:type="dxa" w:w="3685"/>
+            <w:vAlign w:val="center"/>
+          </w:tcPr>
+          <w:p>
+            <w:pPr>
+              <w:spacing w:before="20" w:after="20" w:line="247" w:lineRule="auto"/>
+            </w:pPr>
+            <w:r>
+              <w:rPr>
+                <w:rFonts w:ascii="Noto Sans CJK SC" w:hAnsi="Noto Sans CJK SC" w:eastAsia="Noto Sans CJK SC"/>
+                <w:sz w:val="17"/>
+              </w:rPr>
+              <w:t>净绕线宽度W（mm）</w:t>
+            </w:r>
+          </w:p>
+        </w:tc>
+        <w:tc>
+          <w:tcPr>
+            <w:tcW w:type="dxa" w:w="6746"/>
+            <w:vAlign w:val="center"/>
+          </w:tcPr>
+          <w:p>
+            <w:pPr>
+              <w:spacing w:before="20" w:after="20" w:line="247" w:lineRule="auto"/>
+            </w:pPr>
+            <w:r>
+              <w:rPr>
+                <w:rFonts w:ascii="Noto Sans CJK SC" w:hAnsi="Noto Sans CJK SC" w:eastAsia="Noto Sans CJK SC"/>
+                <w:sz w:val="17"/>
+              </w:rPr>
+              <w:t>________；扣除端部安全留边/挡墙，不是磁芯总宽</w:t>
+            </w:r>
+          </w:p>
+        </w:tc>
+      </w:tr>
+      <w:tr>
+        <w:trPr>
+          <w:cantSplit/>
+        </w:trPr>
+        <w:tc>
+          <w:tcPr>
+            <w:tcW w:type="dxa" w:w="3685"/>
+            <w:vAlign w:val="center"/>
+          </w:tcPr>
+          <w:p>
+            <w:pPr>
+              <w:spacing w:before="20" w:after="20" w:line="247" w:lineRule="auto"/>
+            </w:pPr>
+            <w:r>
+              <w:rPr>
+                <w:rFonts w:ascii="Noto Sans CJK SC" w:hAnsi="Noto Sans CJK SC" w:eastAsia="Noto Sans CJK SC"/>
+                <w:sz w:val="17"/>
+              </w:rPr>
+              <w:t>可绕径向高度H（mm）</w:t>
+            </w:r>
+          </w:p>
+        </w:tc>
+        <w:tc>
+          <w:tcPr>
+            <w:tcW w:type="dxa" w:w="6746"/>
+            <w:vAlign w:val="center"/>
+          </w:tcPr>
+          <w:p>
+            <w:pPr>
+              <w:spacing w:before="20" w:after="20" w:line="247" w:lineRule="auto"/>
+            </w:pPr>
+            <w:r>
+              <w:rPr>
+                <w:rFonts w:ascii="Noto Sans CJK SC" w:hAnsi="Noto Sans CJK SC" w:eastAsia="Noto Sans CJK SC"/>
+                <w:sz w:val="17"/>
+              </w:rPr>
+              <w:t>________；扣除装配、外包和机械余量</w:t>
+            </w:r>
+          </w:p>
+        </w:tc>
+      </w:tr>
+      <w:tr>
+        <w:trPr>
+          <w:cantSplit/>
+        </w:trPr>
+        <w:tc>
+          <w:tcPr>
+            <w:tcW w:type="dxa" w:w="3685"/>
+            <w:vAlign w:val="center"/>
+          </w:tcPr>
+          <w:p>
+            <w:pPr>
+              <w:spacing w:before="20" w:after="20" w:line="247" w:lineRule="auto"/>
+            </w:pPr>
+            <w:r>
+              <w:rPr>
+                <w:rFonts w:ascii="Noto Sans CJK SC" w:hAnsi="Noto Sans CJK SC" w:eastAsia="Noto Sans CJK SC"/>
+                <w:sz w:val="17"/>
+              </w:rPr>
+              <w:t>磁芯Ae/Ve、材质</w:t>
+            </w:r>
+          </w:p>
+        </w:tc>
+        <w:tc>
+          <w:tcPr>
+            <w:tcW w:type="dxa" w:w="6746"/>
+            <w:vAlign w:val="center"/>
+          </w:tcPr>
+          <w:p>
+            <w:pPr>
+              <w:spacing w:before="20" w:after="20" w:line="247" w:lineRule="auto"/>
+            </w:pPr>
+            <w:r>
+              <w:rPr>
+                <w:rFonts w:ascii="Noto Sans CJK SC" w:hAnsi="Noto Sans CJK SC" w:eastAsia="Noto Sans CJK SC"/>
+                <w:sz w:val="17"/>
+              </w:rPr>
+              <w:t>________；需供应商真实数据，不用PQ型号猜Ae</w:t>
+            </w:r>
+          </w:p>
+        </w:tc>
+      </w:tr>
+      <w:tr>
+        <w:trPr>
+          <w:cantSplit/>
+        </w:trPr>
+        <w:tc>
+          <w:tcPr>
+            <w:tcW w:type="dxa" w:w="3685"/>
+            <w:vAlign w:val="center"/>
+          </w:tcPr>
+          <w:p>
+            <w:pPr>
+              <w:spacing w:before="20" w:after="20" w:line="247" w:lineRule="auto"/>
+            </w:pPr>
+            <w:r>
+              <w:rPr>
+                <w:rFonts w:ascii="Noto Sans CJK SC" w:hAnsi="Noto Sans CJK SC" w:eastAsia="Noto Sans CJK SC"/>
+                <w:sz w:val="17"/>
+              </w:rPr>
+              <w:t>当前主/次线材</w:t>
+            </w:r>
+          </w:p>
+        </w:tc>
+        <w:tc>
+          <w:tcPr>
+            <w:tcW w:type="dxa" w:w="6746"/>
+            <w:vAlign w:val="center"/>
+          </w:tcPr>
+          <w:p>
+            <w:pPr>
+              <w:spacing w:before="20" w:after="20" w:line="247" w:lineRule="auto"/>
+            </w:pPr>
+            <w:r>
+              <w:rPr>
+                <w:rFonts w:ascii="Noto Sans CJK SC" w:hAnsi="Noto Sans CJK SC" w:eastAsia="Noto Sans CJK SC"/>
+                <w:sz w:val="17"/>
+              </w:rPr>
+              <w:t>单股径×并股数：________ / ________</w:t>
+            </w:r>
+          </w:p>
+        </w:tc>
+      </w:tr>
+      <w:tr>
+        <w:trPr>
+          <w:cantSplit/>
+        </w:trPr>
+        <w:tc>
+          <w:tcPr>
+            <w:tcW w:type="dxa" w:w="3685"/>
+            <w:vAlign w:val="center"/>
+          </w:tcPr>
+          <w:p>
+            <w:pPr>
+              <w:spacing w:before="20" w:after="20" w:line="247" w:lineRule="auto"/>
+            </w:pPr>
+            <w:r>
+              <w:rPr>
+                <w:rFonts w:ascii="Noto Sans CJK SC" w:hAnsi="Noto Sans CJK SC" w:eastAsia="Noto Sans CJK SC"/>
+                <w:sz w:val="17"/>
+              </w:rPr>
+              <w:t>主/次成品尺寸</w:t>
+            </w:r>
+          </w:p>
+        </w:tc>
+        <w:tc>
+          <w:tcPr>
+            <w:tcW w:type="dxa" w:w="6746"/>
+            <w:vAlign w:val="center"/>
+          </w:tcPr>
+          <w:p>
+            <w:pPr>
+              <w:spacing w:before="20" w:after="20" w:line="247" w:lineRule="auto"/>
+            </w:pPr>
+            <w:r>
+              <w:rPr>
+                <w:rFonts w:ascii="Noto Sans CJK SC" w:hAnsi="Noto Sans CJK SC" w:eastAsia="Noto Sans CJK SC"/>
+                <w:sz w:val="17"/>
+              </w:rPr>
+              <w:t>含漆膜/包带的实际外径或宽×厚：________ / ________</w:t>
+            </w:r>
+          </w:p>
+        </w:tc>
+      </w:tr>
+      <w:tr>
+        <w:trPr>
+          <w:cantSplit/>
+        </w:trPr>
+        <w:tc>
+          <w:tcPr>
+            <w:tcW w:type="dxa" w:w="3685"/>
+            <w:vAlign w:val="center"/>
+          </w:tcPr>
+          <w:p>
+            <w:pPr>
+              <w:spacing w:before="20" w:after="20" w:line="247" w:lineRule="auto"/>
+            </w:pPr>
+            <w:r>
+              <w:rPr>
+                <w:rFonts w:ascii="Noto Sans CJK SC" w:hAnsi="Noto Sans CJK SC" w:eastAsia="Noto Sans CJK SC"/>
+                <w:sz w:val="17"/>
+              </w:rPr>
+              <w:t>原副隔离/层间/外包厚度</w:t>
+            </w:r>
+          </w:p>
+        </w:tc>
+        <w:tc>
+          <w:tcPr>
+            <w:tcW w:type="dxa" w:w="6746"/>
+            <w:vAlign w:val="center"/>
+          </w:tcPr>
+          <w:p>
+            <w:pPr>
+              <w:spacing w:before="20" w:after="20" w:line="247" w:lineRule="auto"/>
+            </w:pPr>
+            <w:r>
+              <w:rPr>
+                <w:rFonts w:ascii="Noto Sans CJK SC" w:hAnsi="Noto Sans CJK SC" w:eastAsia="Noto Sans CJK SC"/>
+                <w:sz w:val="17"/>
+              </w:rPr>
+              <w:t>________；辅助绕组、交叉线与飞线根部也计入</w:t>
+            </w:r>
+          </w:p>
+        </w:tc>
+      </w:tr>
+      <w:tr>
+        <w:trPr>
+          <w:cantSplit/>
+        </w:trPr>
+        <w:tc>
+          <w:tcPr>
+            <w:tcW w:type="dxa" w:w="3685"/>
+            <w:vAlign w:val="center"/>
+          </w:tcPr>
+          <w:p>
+            <w:pPr>
+              <w:spacing w:before="20" w:after="20" w:line="247" w:lineRule="auto"/>
+            </w:pPr>
+            <w:r>
+              <w:rPr>
+                <w:rFonts w:ascii="Noto Sans CJK SC" w:hAnsi="Noto Sans CJK SC" w:eastAsia="Noto Sans CJK SC"/>
+                <w:sz w:val="17"/>
+              </w:rPr>
+              <w:t>冷却条件/当前实绕照片</w:t>
+            </w:r>
+          </w:p>
+        </w:tc>
+        <w:tc>
+          <w:tcPr>
+            <w:tcW w:type="dxa" w:w="6746"/>
+            <w:vAlign w:val="center"/>
+          </w:tcPr>
+          <w:p>
+            <w:pPr>
+              <w:spacing w:before="20" w:after="20" w:line="247" w:lineRule="auto"/>
+            </w:pPr>
+            <w:r>
+              <w:rPr>
+                <w:rFonts w:ascii="Noto Sans CJK SC" w:hAnsi="Noto Sans CJK SC" w:eastAsia="Noto Sans CJK SC"/>
+                <w:sz w:val="17"/>
+              </w:rPr>
+              <w:t>________；连续1kW需热稳态验证</w:t>
+            </w:r>
+          </w:p>
+        </w:tc>
+      </w:tr>
+    </w:tbl>
+    <w:p>
+      <w:pPr>
+        <w:spacing w:after="30"/>
+      </w:pPr>
+      <w:r>
+        <w:rPr>
+          <w:rFonts w:ascii="Noto Sans CJK SC" w:hAnsi="Noto Sans CJK SC" w:eastAsia="Noto Sans CJK SC"/>
+          <w:b/>
+          <w:sz w:val="20"/>
+        </w:rPr>
+        <w:t>保守方格排层算法</w:t>
+      </w:r>
+    </w:p>
+    <w:p>
+      <w:pPr>
+        <w:spacing w:after="30"/>
+      </w:pPr>
+      <w:r>
+        <w:rPr>
+          <w:rFonts w:ascii="Noto Sans CJK SC" w:hAnsi="Noto Sans CJK SC" w:eastAsia="Noto Sans CJK SC"/>
+          <w:b w:val="0"/>
+          <w:sz w:val="18"/>
+        </w:rPr>
+        <w:t>单束每层匝数k=floor(W/p)，p为实际排线节距且不得小于成品外径；q束并绕时轴向节距q×p。层数L=ceil(N/k)，径向厚度h=L×成品外径。分裂初级内、外半分别取整。H需要=各绕组厚度＋全部绝缘＋辅助/交叉线＋外包及装配余量，必须≤H。扁形利兹用真实宽度和厚度，不用裸铜等效直径。</w:t>
+      </w:r>
+    </w:p>
+    <w:p>
+      <w:pPr>
+        <w:spacing w:after="30"/>
+      </w:pPr>
+      <w:r>
+        <w:rPr>
+          <w:rFonts w:ascii="Noto Sans CJK SC" w:hAnsi="Noto Sans CJK SC" w:eastAsia="Noto Sans CJK SC"/>
+          <w:b/>
+          <w:sz w:val="17"/>
+        </w:rPr>
+        <w:t>演示不是PQ3235实际尺寸：假定W=20mm、初束外径1.45mm、次单束外径3.20mm。</w:t>
+      </w:r>
+    </w:p>
+    <w:tbl>
+      <w:tblPr>
+        <w:tblStyle w:val="5"/>
+        <w:tblW w:type="auto" w:w="0"/>
+        <w:jc w:val="center"/>
+        <w:tblLayout w:type="fixed"/>
+        <w:tblLook w:firstColumn="1" w:firstRow="1" w:lastColumn="0" w:lastRow="0" w:noHBand="0" w:noVBand="1" w:val="04A0"/>
+      </w:tblPr>
+      <w:tblGrid>
+        <w:gridCol w:w="1587"/>
+        <w:gridCol w:w="1304"/>
+        <w:gridCol w:w="2268"/>
+        <w:gridCol w:w="2098"/>
+        <w:gridCol w:w="3175"/>
+      </w:tblGrid>
+      <w:tr>
+        <w:trPr>
+          <w:cantSplit/>
+        </w:trPr>
+        <w:tc>
+          <w:tcPr>
+            <w:tcW w:type="dxa" w:w="2093"/>
+            <w:vAlign w:val="center"/>
+            <w:shd w:fill="E9EEF4"/>
+          </w:tcPr>
+          <w:p>
+            <w:pPr>
+              <w:spacing w:before="20" w:after="20" w:line="247" w:lineRule="auto"/>
+            </w:pPr>
+            <w:r>
+              <w:rPr>
+                <w:rFonts w:ascii="Noto Sans CJK SC" w:hAnsi="Noto Sans CJK SC" w:eastAsia="Noto Sans CJK SC"/>
+                <w:b/>
+                <w:sz w:val="16"/>
+              </w:rPr>
+              <w:t>候选Np:Ns</w:t>
+            </w:r>
+          </w:p>
+        </w:tc>
+        <w:tc>
+          <w:tcPr>
+            <w:tcW w:type="dxa" w:w="2093"/>
+            <w:vAlign w:val="center"/>
+            <w:shd w:fill="E9EEF4"/>
+          </w:tcPr>
+          <w:p>
+            <w:pPr>
+              <w:spacing w:before="20" w:after="20" w:line="247" w:lineRule="auto"/>
+            </w:pPr>
+            <w:r>
+              <w:rPr>
+                <w:rFonts w:ascii="Noto Sans CJK SC" w:hAnsi="Noto Sans CJK SC" w:eastAsia="Noto Sans CJK SC"/>
+                <w:b/>
+                <w:sz w:val="16"/>
+              </w:rPr>
+              <w:t>D/路</w:t>
+            </w:r>
+          </w:p>
+        </w:tc>
+        <w:tc>
+          <w:tcPr>
+            <w:tcW w:type="dxa" w:w="2093"/>
+            <w:vAlign w:val="center"/>
+            <w:shd w:fill="E9EEF4"/>
+          </w:tcPr>
+          <w:p>
+            <w:pPr>
+              <w:spacing w:before="20" w:after="20" w:line="247" w:lineRule="auto"/>
+            </w:pPr>
+            <w:r>
+              <w:rPr>
+                <w:rFonts w:ascii="Noto Sans CJK SC" w:hAnsi="Noto Sans CJK SC" w:eastAsia="Noto Sans CJK SC"/>
+                <w:b/>
+                <w:sz w:val="16"/>
+              </w:rPr>
+              <w:t>ΔB，Ae160例</w:t>
+            </w:r>
+          </w:p>
+        </w:tc>
+        <w:tc>
+          <w:tcPr>
+            <w:tcW w:type="dxa" w:w="2093"/>
+            <w:vAlign w:val="center"/>
+            <w:shd w:fill="E9EEF4"/>
+          </w:tcPr>
+          <w:p>
+            <w:pPr>
+              <w:spacing w:before="20" w:after="20" w:line="247" w:lineRule="auto"/>
+            </w:pPr>
+            <w:r>
+              <w:rPr>
+                <w:rFonts w:ascii="Noto Sans CJK SC" w:hAnsi="Noto Sans CJK SC" w:eastAsia="Noto Sans CJK SC"/>
+                <w:b/>
+                <w:sz w:val="16"/>
+              </w:rPr>
+              <w:t>主/次层数</w:t>
+            </w:r>
+          </w:p>
+        </w:tc>
+        <w:tc>
+          <w:tcPr>
+            <w:tcW w:type="dxa" w:w="2093"/>
+            <w:vAlign w:val="center"/>
+            <w:shd w:fill="E9EEF4"/>
+          </w:tcPr>
+          <w:p>
+            <w:pPr>
+              <w:spacing w:before="20" w:after="20" w:line="247" w:lineRule="auto"/>
+            </w:pPr>
+            <w:r>
+              <w:rPr>
+                <w:rFonts w:ascii="Noto Sans CJK SC" w:hAnsi="Noto Sans CJK SC" w:eastAsia="Noto Sans CJK SC"/>
+                <w:b/>
+                <w:sz w:val="16"/>
+              </w:rPr>
+              <w:t>仅主次径向厚度</w:t>
+            </w:r>
+          </w:p>
+        </w:tc>
+      </w:tr>
+      <w:tr>
+        <w:trPr>
+          <w:cantSplit/>
+        </w:trPr>
+        <w:tc>
+          <w:tcPr>
+            <w:tcW w:type="dxa" w:w="1587"/>
+            <w:vAlign w:val="center"/>
+          </w:tcPr>
+          <w:p>
+            <w:pPr>
+              <w:spacing w:before="20" w:after="20" w:line="247" w:lineRule="auto"/>
+            </w:pPr>
+            <w:r>
+              <w:rPr>
+                <w:rFonts w:ascii="Noto Sans CJK SC" w:hAnsi="Noto Sans CJK SC" w:eastAsia="Noto Sans CJK SC"/>
+                <w:sz w:val="16"/>
+              </w:rPr>
+              <w:t>52:8</w:t>
+            </w:r>
+          </w:p>
+        </w:tc>
+        <w:tc>
+          <w:tcPr>
+            <w:tcW w:type="dxa" w:w="1304"/>
+            <w:vAlign w:val="center"/>
+          </w:tcPr>
+          <w:p>
+            <w:pPr>
+              <w:spacing w:before="20" w:after="20" w:line="247" w:lineRule="auto"/>
+            </w:pPr>
+            <w:r>
+              <w:rPr>
+                <w:rFonts w:ascii="Noto Sans CJK SC" w:hAnsi="Noto Sans CJK SC" w:eastAsia="Noto Sans CJK SC"/>
+                <w:sz w:val="16"/>
+              </w:rPr>
+              <w:t>0.4191</w:t>
+            </w:r>
+          </w:p>
+        </w:tc>
+        <w:tc>
+          <w:tcPr>
+            <w:tcW w:type="dxa" w:w="2268"/>
+            <w:vAlign w:val="center"/>
+          </w:tcPr>
+          <w:p>
+            <w:pPr>
+              <w:spacing w:before="20" w:after="20" w:line="247" w:lineRule="auto"/>
+            </w:pPr>
+            <w:r>
+              <w:rPr>
+                <w:rFonts w:ascii="Noto Sans CJK SC" w:hAnsi="Noto Sans CJK SC" w:eastAsia="Noto Sans CJK SC"/>
+                <w:sz w:val="16"/>
+              </w:rPr>
+              <w:t>0.174T</w:t>
+            </w:r>
+          </w:p>
+        </w:tc>
+        <w:tc>
+          <w:tcPr>
+            <w:tcW w:type="dxa" w:w="2098"/>
+            <w:vAlign w:val="center"/>
+          </w:tcPr>
+          <w:p>
+            <w:pPr>
+              <w:spacing w:before="20" w:after="20" w:line="247" w:lineRule="auto"/>
+            </w:pPr>
+            <w:r>
+              <w:rPr>
+                <w:rFonts w:ascii="Noto Sans CJK SC" w:hAnsi="Noto Sans CJK SC" w:eastAsia="Noto Sans CJK SC"/>
+                <w:sz w:val="16"/>
+              </w:rPr>
+              <w:t>2+2 / 2</w:t>
+            </w:r>
+          </w:p>
+        </w:tc>
+        <w:tc>
+          <w:tcPr>
+            <w:tcW w:type="dxa" w:w="3175"/>
+            <w:vAlign w:val="center"/>
+          </w:tcPr>
+          <w:p>
+            <w:pPr>
+              <w:spacing w:before="20" w:after="20" w:line="247" w:lineRule="auto"/>
+            </w:pPr>
+            <w:r>
+              <w:rPr>
+                <w:rFonts w:ascii="Noto Sans CJK SC" w:hAnsi="Noto Sans CJK SC" w:eastAsia="Noto Sans CJK SC"/>
+                <w:sz w:val="16"/>
+              </w:rPr>
+              <w:t>12.2mm</w:t>
+            </w:r>
+          </w:p>
+        </w:tc>
+      </w:tr>
+      <w:tr>
+        <w:trPr>
+          <w:cantSplit/>
+        </w:trPr>
+        <w:tc>
+          <w:tcPr>
+            <w:tcW w:type="dxa" w:w="1587"/>
+            <w:vAlign w:val="center"/>
+          </w:tcPr>
+          <w:p>
+            <w:pPr>
+              <w:spacing w:before="20" w:after="20" w:line="247" w:lineRule="auto"/>
+            </w:pPr>
+            <w:r>
+              <w:rPr>
+                <w:rFonts w:ascii="Noto Sans CJK SC" w:hAnsi="Noto Sans CJK SC" w:eastAsia="Noto Sans CJK SC"/>
+                <w:sz w:val="16"/>
+              </w:rPr>
+              <w:t>46:7</w:t>
+            </w:r>
+          </w:p>
+        </w:tc>
+        <w:tc>
+          <w:tcPr>
+            <w:tcW w:type="dxa" w:w="1304"/>
+            <w:vAlign w:val="center"/>
+          </w:tcPr>
+          <w:p>
+            <w:pPr>
+              <w:spacing w:before="20" w:after="20" w:line="247" w:lineRule="auto"/>
+            </w:pPr>
+            <w:r>
+              <w:rPr>
+                <w:rFonts w:ascii="Noto Sans CJK SC" w:hAnsi="Noto Sans CJK SC" w:eastAsia="Noto Sans CJK SC"/>
+                <w:sz w:val="16"/>
+              </w:rPr>
+              <w:t>0.4237</w:t>
+            </w:r>
+          </w:p>
+        </w:tc>
+        <w:tc>
+          <w:tcPr>
+            <w:tcW w:type="dxa" w:w="2268"/>
+            <w:vAlign w:val="center"/>
+          </w:tcPr>
+          <w:p>
+            <w:pPr>
+              <w:spacing w:before="20" w:after="20" w:line="247" w:lineRule="auto"/>
+            </w:pPr>
+            <w:r>
+              <w:rPr>
+                <w:rFonts w:ascii="Noto Sans CJK SC" w:hAnsi="Noto Sans CJK SC" w:eastAsia="Noto Sans CJK SC"/>
+                <w:sz w:val="16"/>
+              </w:rPr>
+              <w:t>0.199T</w:t>
+            </w:r>
+          </w:p>
+        </w:tc>
+        <w:tc>
+          <w:tcPr>
+            <w:tcW w:type="dxa" w:w="2098"/>
+            <w:vAlign w:val="center"/>
+          </w:tcPr>
+          <w:p>
+            <w:pPr>
+              <w:spacing w:before="20" w:after="20" w:line="247" w:lineRule="auto"/>
+            </w:pPr>
+            <w:r>
+              <w:rPr>
+                <w:rFonts w:ascii="Noto Sans CJK SC" w:hAnsi="Noto Sans CJK SC" w:eastAsia="Noto Sans CJK SC"/>
+                <w:sz w:val="16"/>
+              </w:rPr>
+              <w:t>2+2 / 2</w:t>
+            </w:r>
+          </w:p>
+        </w:tc>
+        <w:tc>
+          <w:tcPr>
+            <w:tcW w:type="dxa" w:w="3175"/>
+            <w:vAlign w:val="center"/>
+          </w:tcPr>
+          <w:p>
+            <w:pPr>
+              <w:spacing w:before="20" w:after="20" w:line="247" w:lineRule="auto"/>
+            </w:pPr>
+            <w:r>
+              <w:rPr>
+                <w:rFonts w:ascii="Noto Sans CJK SC" w:hAnsi="Noto Sans CJK SC" w:eastAsia="Noto Sans CJK SC"/>
+                <w:sz w:val="16"/>
+              </w:rPr>
+              <w:t>12.2mm</w:t>
+            </w:r>
+          </w:p>
+        </w:tc>
+      </w:tr>
+      <w:tr>
+        <w:trPr>
+          <w:cantSplit/>
+        </w:trPr>
+        <w:tc>
+          <w:tcPr>
+            <w:tcW w:type="dxa" w:w="1587"/>
+            <w:vAlign w:val="center"/>
+          </w:tcPr>
+          <w:p>
+            <w:pPr>
+              <w:spacing w:before="20" w:after="20" w:line="247" w:lineRule="auto"/>
+            </w:pPr>
+            <w:r>
+              <w:rPr>
+                <w:rFonts w:ascii="Noto Sans CJK SC" w:hAnsi="Noto Sans CJK SC" w:eastAsia="Noto Sans CJK SC"/>
+                <w:sz w:val="16"/>
+              </w:rPr>
+              <w:t>45:7</w:t>
+            </w:r>
+          </w:p>
+        </w:tc>
+        <w:tc>
+          <w:tcPr>
+            <w:tcW w:type="dxa" w:w="1304"/>
+            <w:vAlign w:val="center"/>
+          </w:tcPr>
+          <w:p>
+            <w:pPr>
+              <w:spacing w:before="20" w:after="20" w:line="247" w:lineRule="auto"/>
+            </w:pPr>
+            <w:r>
+              <w:rPr>
+                <w:rFonts w:ascii="Noto Sans CJK SC" w:hAnsi="Noto Sans CJK SC" w:eastAsia="Noto Sans CJK SC"/>
+                <w:sz w:val="16"/>
+              </w:rPr>
+              <w:t>0.4145</w:t>
+            </w:r>
+          </w:p>
+        </w:tc>
+        <w:tc>
+          <w:tcPr>
+            <w:tcW w:type="dxa" w:w="2268"/>
+            <w:vAlign w:val="center"/>
+          </w:tcPr>
+          <w:p>
+            <w:pPr>
+              <w:spacing w:before="20" w:after="20" w:line="247" w:lineRule="auto"/>
+            </w:pPr>
+            <w:r>
+              <w:rPr>
+                <w:rFonts w:ascii="Noto Sans CJK SC" w:hAnsi="Noto Sans CJK SC" w:eastAsia="Noto Sans CJK SC"/>
+                <w:sz w:val="16"/>
+              </w:rPr>
+              <w:t>0.199T</w:t>
+            </w:r>
+          </w:p>
+        </w:tc>
+        <w:tc>
+          <w:tcPr>
+            <w:tcW w:type="dxa" w:w="2098"/>
+            <w:vAlign w:val="center"/>
+          </w:tcPr>
+          <w:p>
+            <w:pPr>
+              <w:spacing w:before="20" w:after="20" w:line="247" w:lineRule="auto"/>
+            </w:pPr>
+            <w:r>
+              <w:rPr>
+                <w:rFonts w:ascii="Noto Sans CJK SC" w:hAnsi="Noto Sans CJK SC" w:eastAsia="Noto Sans CJK SC"/>
+                <w:sz w:val="16"/>
+              </w:rPr>
+              <w:t>2+2 / 2</w:t>
+            </w:r>
+          </w:p>
+        </w:tc>
+        <w:tc>
+          <w:tcPr>
+            <w:tcW w:type="dxa" w:w="3175"/>
+            <w:vAlign w:val="center"/>
+          </w:tcPr>
+          <w:p>
+            <w:pPr>
+              <w:spacing w:before="20" w:after="20" w:line="247" w:lineRule="auto"/>
+            </w:pPr>
+            <w:r>
+              <w:rPr>
+                <w:rFonts w:ascii="Noto Sans CJK SC" w:hAnsi="Noto Sans CJK SC" w:eastAsia="Noto Sans CJK SC"/>
+                <w:sz w:val="16"/>
+              </w:rPr>
+              <w:t>12.2mm</w:t>
+            </w:r>
+          </w:p>
+        </w:tc>
+      </w:tr>
+      <w:tr>
+        <w:trPr>
+          <w:cantSplit/>
+        </w:trPr>
+        <w:tc>
+          <w:tcPr>
+            <w:tcW w:type="dxa" w:w="1587"/>
+            <w:vAlign w:val="center"/>
+          </w:tcPr>
+          <w:p>
+            <w:pPr>
+              <w:spacing w:before="20" w:after="20" w:line="247" w:lineRule="auto"/>
+            </w:pPr>
+            <w:r>
+              <w:rPr>
+                <w:rFonts w:ascii="Noto Sans CJK SC" w:hAnsi="Noto Sans CJK SC" w:eastAsia="Noto Sans CJK SC"/>
+                <w:sz w:val="16"/>
+              </w:rPr>
+              <w:t>39:6</w:t>
+            </w:r>
+          </w:p>
+        </w:tc>
+        <w:tc>
+          <w:tcPr>
+            <w:tcW w:type="dxa" w:w="1304"/>
+            <w:vAlign w:val="center"/>
+          </w:tcPr>
+          <w:p>
+            <w:pPr>
+              <w:spacing w:before="20" w:after="20" w:line="247" w:lineRule="auto"/>
+            </w:pPr>
+            <w:r>
+              <w:rPr>
+                <w:rFonts w:ascii="Noto Sans CJK SC" w:hAnsi="Noto Sans CJK SC" w:eastAsia="Noto Sans CJK SC"/>
+                <w:sz w:val="16"/>
+              </w:rPr>
+              <w:t>0.4191</w:t>
+            </w:r>
+          </w:p>
+        </w:tc>
+        <w:tc>
+          <w:tcPr>
+            <w:tcW w:type="dxa" w:w="2268"/>
+            <w:vAlign w:val="center"/>
+          </w:tcPr>
+          <w:p>
+            <w:pPr>
+              <w:spacing w:before="20" w:after="20" w:line="247" w:lineRule="auto"/>
+            </w:pPr>
+            <w:r>
+              <w:rPr>
+                <w:rFonts w:ascii="Noto Sans CJK SC" w:hAnsi="Noto Sans CJK SC" w:eastAsia="Noto Sans CJK SC"/>
+                <w:sz w:val="16"/>
+              </w:rPr>
+              <w:t>0.232T</w:t>
+            </w:r>
+          </w:p>
+        </w:tc>
+        <w:tc>
+          <w:tcPr>
+            <w:tcW w:type="dxa" w:w="2098"/>
+            <w:vAlign w:val="center"/>
+          </w:tcPr>
+          <w:p>
+            <w:pPr>
+              <w:spacing w:before="20" w:after="20" w:line="247" w:lineRule="auto"/>
+            </w:pPr>
+            <w:r>
+              <w:rPr>
+                <w:rFonts w:ascii="Noto Sans CJK SC" w:hAnsi="Noto Sans CJK SC" w:eastAsia="Noto Sans CJK SC"/>
+                <w:sz w:val="16"/>
+              </w:rPr>
+              <w:t>2+2 / 1</w:t>
+            </w:r>
+          </w:p>
+        </w:tc>
+        <w:tc>
+          <w:tcPr>
+            <w:tcW w:type="dxa" w:w="3175"/>
+            <w:vAlign w:val="center"/>
+          </w:tcPr>
+          <w:p>
+            <w:pPr>
+              <w:spacing w:before="20" w:after="20" w:line="247" w:lineRule="auto"/>
+            </w:pPr>
+            <w:r>
+              <w:rPr>
+                <w:rFonts w:ascii="Noto Sans CJK SC" w:hAnsi="Noto Sans CJK SC" w:eastAsia="Noto Sans CJK SC"/>
+                <w:sz w:val="16"/>
+              </w:rPr>
+              <w:t>9.0mm</w:t>
+            </w:r>
+          </w:p>
+        </w:tc>
+      </w:tr>
+    </w:tbl>
+    <w:p>
+      <w:pPr>
+        <w:spacing w:after="30"/>
+      </w:pPr>
+      <w:r>
+        <w:rPr>
+          <w:rFonts w:ascii="Noto Sans CJK SC" w:hAnsi="Noto Sans CJK SC" w:eastAsia="Noto Sans CJK SC"/>
+          <w:b w:val="0"/>
+          <w:sz w:val="17"/>
+        </w:rPr>
+        <w:t>上述还没加辅助绕组、绝缘和余量。52匝减到45/46匝，在这个例子里没有减少层数；39:6虽省一层，却提高磁通33%，辅助2T的原始幅值升至约19.49V，驱动不能照搬。</w:t>
+      </w:r>
+    </w:p>
+    <w:p>
+      <w:pPr>
+        <w:spacing w:after="30"/>
+      </w:pPr>
+      <w:r>
+        <w:rPr>
+          <w:rFonts w:ascii="Noto Sans CJK SC" w:hAnsi="Noto Sans CJK SC" w:eastAsia="Noto Sans CJK SC"/>
+          <w:b/>
+          <w:sz w:val="20"/>
+        </w:rPr>
+        <w:t>可评审的线材取舍，不是生产定值</w:t>
+      </w:r>
+    </w:p>
+    <w:tbl>
+      <w:tblPr>
+        <w:tblStyle w:val="5"/>
+        <w:tblW w:type="auto" w:w="0"/>
+        <w:jc w:val="center"/>
+        <w:tblLayout w:type="fixed"/>
+        <w:tblLook w:firstColumn="1" w:firstRow="1" w:lastColumn="0" w:lastRow="0" w:noHBand="0" w:noVBand="1" w:val="04A0"/>
+      </w:tblPr>
+      <w:tblGrid>
+        <w:gridCol w:w="4082"/>
+        <w:gridCol w:w="1701"/>
+        <w:gridCol w:w="4649"/>
+      </w:tblGrid>
+      <w:tr>
+        <w:trPr>
+          <w:cantSplit/>
+        </w:trPr>
+        <w:tc>
+          <w:tcPr>
+            <w:tcW w:type="dxa" w:w="3489"/>
+            <w:vAlign w:val="center"/>
+            <w:shd w:fill="E9EEF4"/>
+          </w:tcPr>
+          <w:p>
+            <w:pPr>
+              <w:spacing w:before="20" w:after="20" w:line="247" w:lineRule="auto"/>
+            </w:pPr>
+            <w:r>
+              <w:rPr>
+                <w:rFonts w:ascii="Noto Sans CJK SC" w:hAnsi="Noto Sans CJK SC" w:eastAsia="Noto Sans CJK SC"/>
+                <w:b/>
+                <w:sz w:val="16"/>
+              </w:rPr>
+              <w:t>线材候选</w:t>
+            </w:r>
+          </w:p>
+        </w:tc>
+        <w:tc>
+          <w:tcPr>
+            <w:tcW w:type="dxa" w:w="3489"/>
+            <w:vAlign w:val="center"/>
+            <w:shd w:fill="E9EEF4"/>
+          </w:tcPr>
+          <w:p>
+            <w:pPr>
+              <w:spacing w:before="20" w:after="20" w:line="247" w:lineRule="auto"/>
+            </w:pPr>
+            <w:r>
+              <w:rPr>
+                <w:rFonts w:ascii="Noto Sans CJK SC" w:hAnsi="Noto Sans CJK SC" w:eastAsia="Noto Sans CJK SC"/>
+                <w:b/>
+                <w:sz w:val="16"/>
+              </w:rPr>
+              <w:t>裸铜截面</w:t>
+            </w:r>
+          </w:p>
+        </w:tc>
+        <w:tc>
+          <w:tcPr>
+            <w:tcW w:type="dxa" w:w="3489"/>
+            <w:vAlign w:val="center"/>
+            <w:shd w:fill="E9EEF4"/>
+          </w:tcPr>
+          <w:p>
+            <w:pPr>
+              <w:spacing w:before="20" w:after="20" w:line="247" w:lineRule="auto"/>
+            </w:pPr>
+            <w:r>
+              <w:rPr>
+                <w:rFonts w:ascii="Noto Sans CJK SC" w:hAnsi="Noto Sans CJK SC" w:eastAsia="Noto Sans CJK SC"/>
+                <w:b/>
+                <w:sz w:val="16"/>
+              </w:rPr>
+              <w:t>电流密度/限制</w:t>
+            </w:r>
+          </w:p>
+        </w:tc>
+      </w:tr>
+      <w:tr>
+        <w:trPr>
+          <w:cantSplit/>
+        </w:trPr>
+        <w:tc>
+          <w:tcPr>
+            <w:tcW w:type="dxa" w:w="4082"/>
+            <w:vAlign w:val="center"/>
+          </w:tcPr>
+          <w:p>
+            <w:pPr>
+              <w:spacing w:before="20" w:after="20" w:line="247" w:lineRule="auto"/>
+            </w:pPr>
+            <w:r>
+              <w:rPr>
+                <w:rFonts w:ascii="Noto Sans CJK SC" w:hAnsi="Noto Sans CJK SC" w:eastAsia="Noto Sans CJK SC"/>
+                <w:sz w:val="16"/>
+              </w:rPr>
+              <w:t>初级120×0.10mm</w:t>
+            </w:r>
+          </w:p>
+        </w:tc>
+        <w:tc>
+          <w:tcPr>
+            <w:tcW w:type="dxa" w:w="1701"/>
+            <w:vAlign w:val="center"/>
+          </w:tcPr>
+          <w:p>
+            <w:pPr>
+              <w:spacing w:before="20" w:after="20" w:line="247" w:lineRule="auto"/>
+            </w:pPr>
+            <w:r>
+              <w:rPr>
+                <w:rFonts w:ascii="Noto Sans CJK SC" w:hAnsi="Noto Sans CJK SC" w:eastAsia="Noto Sans CJK SC"/>
+                <w:sz w:val="16"/>
+              </w:rPr>
+              <w:t>0.942mm²</w:t>
+            </w:r>
+          </w:p>
+        </w:tc>
+        <w:tc>
+          <w:tcPr>
+            <w:tcW w:type="dxa" w:w="4649"/>
+            <w:vAlign w:val="center"/>
+          </w:tcPr>
+          <w:p>
+            <w:pPr>
+              <w:spacing w:before="20" w:after="20" w:line="247" w:lineRule="auto"/>
+            </w:pPr>
+            <w:r>
+              <w:rPr>
+                <w:rFonts w:ascii="Noto Sans CJK SC" w:hAnsi="Noto Sans CJK SC" w:eastAsia="Noto Sans CJK SC"/>
+                <w:sz w:val="16"/>
+              </w:rPr>
+              <w:t>约4.4A/mm²；需实际成品尺寸</w:t>
+            </w:r>
+          </w:p>
+        </w:tc>
+      </w:tr>
+      <w:tr>
+        <w:trPr>
+          <w:cantSplit/>
+        </w:trPr>
+        <w:tc>
+          <w:tcPr>
+            <w:tcW w:type="dxa" w:w="4082"/>
+            <w:vAlign w:val="center"/>
+          </w:tcPr>
+          <w:p>
+            <w:pPr>
+              <w:spacing w:before="20" w:after="20" w:line="247" w:lineRule="auto"/>
+            </w:pPr>
+            <w:r>
+              <w:rPr>
+                <w:rFonts w:ascii="Noto Sans CJK SC" w:hAnsi="Noto Sans CJK SC" w:eastAsia="Noto Sans CJK SC"/>
+                <w:sz w:val="16"/>
+              </w:rPr>
+              <w:t>初级100×0.10mm</w:t>
+            </w:r>
+          </w:p>
+        </w:tc>
+        <w:tc>
+          <w:tcPr>
+            <w:tcW w:type="dxa" w:w="1701"/>
+            <w:vAlign w:val="center"/>
+          </w:tcPr>
+          <w:p>
+            <w:pPr>
+              <w:spacing w:before="20" w:after="20" w:line="247" w:lineRule="auto"/>
+            </w:pPr>
+            <w:r>
+              <w:rPr>
+                <w:rFonts w:ascii="Noto Sans CJK SC" w:hAnsi="Noto Sans CJK SC" w:eastAsia="Noto Sans CJK SC"/>
+                <w:sz w:val="16"/>
+              </w:rPr>
+              <w:t>0.785mm²</w:t>
+            </w:r>
+          </w:p>
+        </w:tc>
+        <w:tc>
+          <w:tcPr>
+            <w:tcW w:type="dxa" w:w="4649"/>
+            <w:vAlign w:val="center"/>
+          </w:tcPr>
+          <w:p>
+            <w:pPr>
+              <w:spacing w:before="20" w:after="20" w:line="247" w:lineRule="auto"/>
+            </w:pPr>
+            <w:r>
+              <w:rPr>
+                <w:rFonts w:ascii="Noto Sans CJK SC" w:hAnsi="Noto Sans CJK SC" w:eastAsia="Noto Sans CJK SC"/>
+                <w:sz w:val="16"/>
+              </w:rPr>
+              <w:t>约5.3A/mm²；减铜后须重测损耗</w:t>
+            </w:r>
+          </w:p>
+        </w:tc>
+      </w:tr>
+      <w:tr>
+        <w:trPr>
+          <w:cantSplit/>
+        </w:trPr>
+        <w:tc>
+          <w:tcPr>
+            <w:tcW w:type="dxa" w:w="4082"/>
+            <w:vAlign w:val="center"/>
+          </w:tcPr>
+          <w:p>
+            <w:pPr>
+              <w:spacing w:before="20" w:after="20" w:line="247" w:lineRule="auto"/>
+            </w:pPr>
+            <w:r>
+              <w:rPr>
+                <w:rFonts w:ascii="Noto Sans CJK SC" w:hAnsi="Noto Sans CJK SC" w:eastAsia="Noto Sans CJK SC"/>
+                <w:sz w:val="16"/>
+              </w:rPr>
+              <w:t>次级500×0.10mm</w:t>
+            </w:r>
+          </w:p>
+        </w:tc>
+        <w:tc>
+          <w:tcPr>
+            <w:tcW w:type="dxa" w:w="1701"/>
+            <w:vAlign w:val="center"/>
+          </w:tcPr>
+          <w:p>
+            <w:pPr>
+              <w:spacing w:before="20" w:after="20" w:line="247" w:lineRule="auto"/>
+            </w:pPr>
+            <w:r>
+              <w:rPr>
+                <w:rFonts w:ascii="Noto Sans CJK SC" w:hAnsi="Noto Sans CJK SC" w:eastAsia="Noto Sans CJK SC"/>
+                <w:sz w:val="16"/>
+              </w:rPr>
+              <w:t>3.927mm²</w:t>
+            </w:r>
+          </w:p>
+        </w:tc>
+        <w:tc>
+          <w:tcPr>
+            <w:tcW w:type="dxa" w:w="4649"/>
+            <w:vAlign w:val="center"/>
+          </w:tcPr>
+          <w:p>
+            <w:pPr>
+              <w:spacing w:before="20" w:after="20" w:line="247" w:lineRule="auto"/>
+            </w:pPr>
+            <w:r>
+              <w:rPr>
+                <w:rFonts w:ascii="Noto Sans CJK SC" w:hAnsi="Noto Sans CJK SC" w:eastAsia="Noto Sans CJK SC"/>
+                <w:sz w:val="16"/>
+              </w:rPr>
+              <w:t>约6.9A/mm²；热风险偏高，不能承诺连续1kW</w:t>
+            </w:r>
+          </w:p>
+        </w:tc>
+      </w:tr>
+      <w:tr>
+        <w:trPr>
+          <w:cantSplit/>
+        </w:trPr>
+        <w:tc>
+          <w:tcPr>
+            <w:tcW w:type="dxa" w:w="4082"/>
+            <w:vAlign w:val="center"/>
+          </w:tcPr>
+          <w:p>
+            <w:pPr>
+              <w:spacing w:before="20" w:after="20" w:line="247" w:lineRule="auto"/>
+            </w:pPr>
+            <w:r>
+              <w:rPr>
+                <w:rFonts w:ascii="Noto Sans CJK SC" w:hAnsi="Noto Sans CJK SC" w:eastAsia="Noto Sans CJK SC"/>
+                <w:sz w:val="16"/>
+              </w:rPr>
+              <w:t>次级两束250×0.10并绕</w:t>
+            </w:r>
+          </w:p>
+        </w:tc>
+        <w:tc>
+          <w:tcPr>
+            <w:tcW w:type="dxa" w:w="1701"/>
+            <w:vAlign w:val="center"/>
+          </w:tcPr>
+          <w:p>
+            <w:pPr>
+              <w:spacing w:before="20" w:after="20" w:line="247" w:lineRule="auto"/>
+            </w:pPr>
+            <w:r>
+              <w:rPr>
+                <w:rFonts w:ascii="Noto Sans CJK SC" w:hAnsi="Noto Sans CJK SC" w:eastAsia="Noto Sans CJK SC"/>
+                <w:sz w:val="16"/>
+              </w:rPr>
+              <w:t>合计3.927mm²</w:t>
+            </w:r>
+          </w:p>
+        </w:tc>
+        <w:tc>
+          <w:tcPr>
+            <w:tcW w:type="dxa" w:w="4649"/>
+            <w:vAlign w:val="center"/>
+          </w:tcPr>
+          <w:p>
+            <w:pPr>
+              <w:spacing w:before="20" w:after="20" w:line="247" w:lineRule="auto"/>
+            </w:pPr>
+            <w:r>
+              <w:rPr>
+                <w:rFonts w:ascii="Noto Sans CJK SC" w:hAnsi="Noto Sans CJK SC" w:eastAsia="Noto Sans CJK SC"/>
+                <w:sz w:val="16"/>
+              </w:rPr>
+              <w:t>有机会改善排层，铜损不降低；需等长均流</w:t>
+            </w:r>
+          </w:p>
+        </w:tc>
+      </w:tr>
+      <w:tr>
+        <w:trPr>
+          <w:cantSplit/>
+        </w:trPr>
+        <w:tc>
+          <w:tcPr>
+            <w:tcW w:type="dxa" w:w="4082"/>
+            <w:vAlign w:val="center"/>
+          </w:tcPr>
+          <w:p>
+            <w:pPr>
+              <w:spacing w:before="20" w:after="20" w:line="247" w:lineRule="auto"/>
+            </w:pPr>
+            <w:r>
+              <w:rPr>
+                <w:rFonts w:ascii="Noto Sans CJK SC" w:hAnsi="Noto Sans CJK SC" w:eastAsia="Noto Sans CJK SC"/>
+                <w:sz w:val="16"/>
+              </w:rPr>
+              <w:t>次级两束400×0.10并绕</w:t>
+            </w:r>
+          </w:p>
+        </w:tc>
+        <w:tc>
+          <w:tcPr>
+            <w:tcW w:type="dxa" w:w="1701"/>
+            <w:vAlign w:val="center"/>
+          </w:tcPr>
+          <w:p>
+            <w:pPr>
+              <w:spacing w:before="20" w:after="20" w:line="247" w:lineRule="auto"/>
+            </w:pPr>
+            <w:r>
+              <w:rPr>
+                <w:rFonts w:ascii="Noto Sans CJK SC" w:hAnsi="Noto Sans CJK SC" w:eastAsia="Noto Sans CJK SC"/>
+                <w:sz w:val="16"/>
+              </w:rPr>
+              <w:t>合计6.283mm²</w:t>
+            </w:r>
+          </w:p>
+        </w:tc>
+        <w:tc>
+          <w:tcPr>
+            <w:tcW w:type="dxa" w:w="4649"/>
+            <w:vAlign w:val="center"/>
+          </w:tcPr>
+          <w:p>
+            <w:pPr>
+              <w:spacing w:before="20" w:after="20" w:line="247" w:lineRule="auto"/>
+            </w:pPr>
+            <w:r>
+              <w:rPr>
+                <w:rFonts w:ascii="Noto Sans CJK SC" w:hAnsi="Noto Sans CJK SC" w:eastAsia="Noto Sans CJK SC"/>
+                <w:sz w:val="16"/>
+              </w:rPr>
+              <w:t>约4.3A/mm²；窗口更苛刻</w:t>
+            </w:r>
+          </w:p>
+        </w:tc>
+      </w:tr>
+    </w:tbl>
+    <w:p>
+      <w:pPr>
+        <w:spacing w:after="30"/>
+      </w:pPr>
+      <w:r>
+        <w:rPr>
+          <w:rFonts w:ascii="Noto Sans CJK SC" w:hAnsi="Noto Sans CJK SC" w:eastAsia="Noto Sans CJK SC"/>
+          <w:b w:val="0"/>
+          <w:sz w:val="17"/>
+        </w:rPr>
+        <w:t>优先取得实物尺寸，再试真正换位的多束并绕或稳定尺寸的扁形利兹（仍是线材，不是铜箔）。110kHz时不能把普通粗软电缆直接当作低损耗绕组，也不能减匝、减绝缘来强行满足窗口。</w:t>
+      </w:r>
+    </w:p>
+    <w:p>
+      <w:pPr>
+        <w:spacing w:after="30"/>
+      </w:pPr>
+      <w:r>
+        <w:rPr>
+          <w:rFonts w:ascii="Noto Sans CJK SC" w:hAnsi="Noto Sans CJK SC" w:eastAsia="Noto Sans CJK SC"/>
+          <w:b/>
+          <w:color w:val="9C2D22"/>
+          <w:sz w:val="18"/>
+        </w:rPr>
+        <w:t>待W/H/Ae/线材确认后，输出最终排层图、定版匝数/线规和满载验收；不满足时应调整磁芯/骨架或连续功率。</w:t>
       </w:r>
     </w:p>
     <w:sectPr>
@@ -3574,7 +4932,7 @@
       <w:rPr>
         <w:sz w:val="16"/>
       </w:rPr>
-      <w:t xml:space="preserve">PQ3235-380/48-1K-110K　|　V1.0 打样评审　|　</w:t>
+      <w:t xml:space="preserve">PQ3235-380/48-1K-110K　|　V1.1 窗口待确认　|　</w:t>
     </w:r>
     <w:fldSimple w:instr="PAGE"/>
   </w:p>
@@ -3945,7 +5303,7 @@
     <w:uiPriority w:val="0"/>
     <w:pPr>
       <w:widowControl w:val="0"/>
-      <w:spacing w:after="60" w:line="259" w:lineRule="auto"/>
+      <w:spacing w:after="30" w:line="259" w:lineRule="auto"/>
       <w:jc w:val="both"/>
     </w:pPr>
     <w:rPr>

</xml_diff>